<commit_message>
Clausole Circolo nel fac-simile, posti per tutte le clausole, tipo torneo bloccato
- Fac-simile per il circolo: entrano le clausole scelte per il Circolo
  (Spese al posto del paragrafo spese fisso, poi Logistica e Responsabilita')
- Carte intestate (tutte le zone e CRC): aggiunti i posti per Circolo
  Responsabilita' e Arbitro Altro, dopo le altre quattro
- Tipo torneo: dopo la creazione non si cambia; solo il super admin
  puo' correggerlo
- Form notifica: tolto un tag <div doppio
- Test: ClausoleETipoTorneo20261007Test

Co-Authored-By: Claude Opus 5.5 <noreply@anthropic.com>
Claude-Session: https://claude.ai/code/session_01Nq5GpUVW8ZdHE1vq1pkAMb
</commit_message>
<xml_diff>
--- a/storage/lettere_intestate/lettera_intestata_crc.docx
+++ b/storage/lettere_intestate/lettera_intestata_crc.docx
@@ -987,6 +987,120 @@
           <w:lang w:val="it-IT"/>
         </w:rPr>
         <w:t>${/BLOCCO_CLAUSOLA_ARBITRO_COMUNICAZIONI}</w:t>
+      </w:r>
+    </w:p>
+    <w:p>
+      <w:pPr>
+        <w:ind w:left="1347" w:right="1405"/>
+        <w:jc w:val="both"/>
+        <w:rPr>
+          <w:sz w:val="24"/>
+          <w:szCs w:val="24"/>
+          <w:lang w:val="it-IT"/>
+        </w:rPr>
+      </w:pPr>
+      <w:r>
+        <w:rPr>
+          <w:sz w:val="24"/>
+          <w:szCs w:val="24"/>
+          <w:lang w:val="it-IT"/>
+        </w:rPr>
+        <w:t>${BLOCCO_CLAUSOLA_CLUB_RESPONSABILITA}</w:t>
+      </w:r>
+    </w:p>
+    <w:p>
+      <w:pPr>
+        <w:ind w:left="1347" w:right="1405"/>
+        <w:jc w:val="both"/>
+        <w:rPr>
+          <w:sz w:val="24"/>
+          <w:szCs w:val="24"/>
+          <w:lang w:val="it-IT"/>
+        </w:rPr>
+      </w:pPr>
+      <w:r>
+        <w:rPr>
+          <w:sz w:val="24"/>
+          <w:szCs w:val="24"/>
+          <w:lang w:val="it-IT"/>
+        </w:rPr>
+        <w:t>${CLAUSOLA_CLUB_RESPONSABILITA}</w:t>
+      </w:r>
+    </w:p>
+    <w:p>
+      <w:pPr>
+        <w:ind w:left="1347" w:right="1405"/>
+        <w:jc w:val="both"/>
+        <w:rPr>
+          <w:sz w:val="24"/>
+          <w:szCs w:val="24"/>
+          <w:lang w:val="it-IT"/>
+        </w:rPr>
+      </w:pPr>
+      <w:r>
+        <w:rPr>
+          <w:sz w:val="24"/>
+          <w:szCs w:val="24"/>
+          <w:lang w:val="it-IT"/>
+        </w:rPr>
+        <w:t>${/BLOCCO_CLAUSOLA_CLUB_RESPONSABILITA}</w:t>
+      </w:r>
+    </w:p>
+    <w:p>
+      <w:pPr>
+        <w:ind w:left="1347" w:right="1405"/>
+        <w:jc w:val="both"/>
+        <w:rPr>
+          <w:sz w:val="24"/>
+          <w:szCs w:val="24"/>
+          <w:lang w:val="it-IT"/>
+        </w:rPr>
+      </w:pPr>
+      <w:r>
+        <w:rPr>
+          <w:sz w:val="24"/>
+          <w:szCs w:val="24"/>
+          <w:lang w:val="it-IT"/>
+        </w:rPr>
+        <w:t>${BLOCCO_CLAUSOLA_ARBITRO_ALTRO}</w:t>
+      </w:r>
+    </w:p>
+    <w:p>
+      <w:pPr>
+        <w:ind w:left="1347" w:right="1405"/>
+        <w:jc w:val="both"/>
+        <w:rPr>
+          <w:sz w:val="24"/>
+          <w:szCs w:val="24"/>
+          <w:lang w:val="it-IT"/>
+        </w:rPr>
+      </w:pPr>
+      <w:r>
+        <w:rPr>
+          <w:sz w:val="24"/>
+          <w:szCs w:val="24"/>
+          <w:lang w:val="it-IT"/>
+        </w:rPr>
+        <w:t>${CLAUSOLA_ARBITRO_ALTRO}</w:t>
+      </w:r>
+    </w:p>
+    <w:p>
+      <w:pPr>
+        <w:ind w:left="1347" w:right="1405"/>
+        <w:jc w:val="both"/>
+        <w:rPr>
+          <w:sz w:val="24"/>
+          <w:szCs w:val="24"/>
+          <w:lang w:val="it-IT"/>
+        </w:rPr>
+      </w:pPr>
+      <w:r>
+        <w:rPr>
+          <w:sz w:val="24"/>
+          <w:szCs w:val="24"/>
+          <w:lang w:val="it-IT"/>
+        </w:rPr>
+        <w:t>${/BLOCCO_CLAUSOLA_ARBITRO_ALTRO}</w:t>
       </w:r>
     </w:p>
     <w:p>

</xml_diff>